<commit_message>
heb de verwijder knop in de grof schema gezet
</commit_message>
<xml_diff>
--- a/grofontwerp.docx
+++ b/grofontwerp.docx
@@ -412,7 +412,7 @@
         <w:t>──</w:t>
       </w:r>
       <w:r>
-        <w:t xml:space="preserve"> lijst van metingen </w:t>
+        <w:t xml:space="preserve"> lijst </w:t>
       </w:r>
       <w:r>
         <w:rPr>
@@ -437,7 +437,7 @@
         <w:t>└──</w:t>
       </w:r>
       <w:r>
-        <w:t xml:space="preserve"> verwijderknop (per meting) </w:t>
+        <w:t xml:space="preserve"> verwijderknop ( </w:t>
       </w:r>
       <w:r>
         <w:rPr>
@@ -511,16 +511,28 @@
         <w:t>──</w:t>
       </w:r>
       <w:r>
-        <w:t xml:space="preserve"> opslaan in </w:t>
-      </w:r>
-      <w:proofErr w:type="spellStart"/>
-      <w:r>
-        <w:t>LocalStorage</w:t>
-      </w:r>
-      <w:proofErr w:type="spellEnd"/>
+        <w:t xml:space="preserve"> opslaan in LocalStorage </w:t>
+      </w:r>
+      <w:r>
+        <w:rPr>
+          <w:rFonts w:ascii="Aptos" w:hAnsi="Aptos" w:cs="Aptos"/>
+        </w:rPr>
+        <w:t>│</w:t>
+      </w:r>
       <w:r>
         <w:t xml:space="preserve"> </w:t>
       </w:r>
+    </w:p>
+    <w:p>
+      <w:r>
+        <w:rPr>
+          <w:rFonts w:ascii="Aptos" w:hAnsi="Aptos" w:cs="Aptos"/>
+        </w:rPr>
+        <w:t>└──</w:t>
+      </w:r>
+      <w:r>
+        <w:t xml:space="preserve"> tonen van items </w:t>
+      </w:r>
       <w:r>
         <w:rPr>
           <w:rFonts w:ascii="Aptos" w:hAnsi="Aptos" w:cs="Aptos"/>
@@ -534,12 +546,65 @@
     <w:p>
       <w:r>
         <w:rPr>
+          <w:rFonts w:ascii="MS Gothic" w:eastAsia="MS Gothic" w:hAnsi="MS Gothic" w:cs="MS Gothic" w:hint="eastAsia"/>
+        </w:rPr>
+        <w:t>├</w:t>
+      </w:r>
+      <w:r>
+        <w:rPr>
+          <w:rFonts w:ascii="Aptos" w:hAnsi="Aptos" w:cs="Aptos"/>
+        </w:rPr>
+        <w:t>──</w:t>
+      </w:r>
+      <w:r>
+        <w:t xml:space="preserve"> [Mentale Gezondheid] │ </w:t>
+      </w:r>
+    </w:p>
+    <w:p>
+      <w:pPr>
+        <w:rPr>
+          <w:rFonts w:ascii="Aptos" w:hAnsi="Aptos" w:cs="Aptos"/>
+        </w:rPr>
+      </w:pPr>
+      <w:r>
+        <w:rPr>
+          <w:rFonts w:ascii="MS Gothic" w:eastAsia="MS Gothic" w:hAnsi="MS Gothic" w:cs="MS Gothic" w:hint="eastAsia"/>
+        </w:rPr>
+        <w:t>├</w:t>
+      </w:r>
+      <w:r>
+        <w:rPr>
+          <w:rFonts w:ascii="Aptos" w:hAnsi="Aptos" w:cs="Aptos"/>
+        </w:rPr>
+        <w:t>──</w:t>
+      </w:r>
+      <w:r>
+        <w:t xml:space="preserve"> tips </w:t>
+      </w:r>
+      <w:r>
+        <w:rPr>
+          <w:rFonts w:ascii="Aptos" w:hAnsi="Aptos" w:cs="Aptos"/>
+        </w:rPr>
+        <w:t>│</w:t>
+      </w:r>
+    </w:p>
+    <w:p>
+      <w:pPr>
+        <w:rPr>
+          <w:rFonts w:ascii="Aptos" w:hAnsi="Aptos" w:cs="Aptos"/>
+        </w:rPr>
+      </w:pPr>
+      <w:r>
+        <w:t xml:space="preserve"> </w:t>
+      </w:r>
+      <w:r>
+        <w:rPr>
           <w:rFonts w:ascii="Aptos" w:hAnsi="Aptos" w:cs="Aptos"/>
         </w:rPr>
         <w:t>└──</w:t>
       </w:r>
       <w:r>
-        <w:t xml:space="preserve"> tonen van items </w:t>
+        <w:t xml:space="preserve"> uitleg </w:t>
       </w:r>
       <w:r>
         <w:rPr>
@@ -547,64 +612,11 @@
         </w:rPr>
         <w:t>│</w:t>
       </w:r>
+    </w:p>
+    <w:p>
       <w:r>
         <w:t xml:space="preserve"> </w:t>
       </w:r>
-    </w:p>
-    <w:p>
-      <w:r>
-        <w:rPr>
-          <w:rFonts w:ascii="MS Gothic" w:eastAsia="MS Gothic" w:hAnsi="MS Gothic" w:cs="MS Gothic" w:hint="eastAsia"/>
-        </w:rPr>
-        <w:t>├</w:t>
-      </w:r>
-      <w:r>
-        <w:rPr>
-          <w:rFonts w:ascii="Aptos" w:hAnsi="Aptos" w:cs="Aptos"/>
-        </w:rPr>
-        <w:t>──</w:t>
-      </w:r>
-      <w:r>
-        <w:t xml:space="preserve"> [Mentale Gezondheid] │ </w:t>
-      </w:r>
-    </w:p>
-    <w:p>
-      <w:pPr>
-        <w:rPr>
-          <w:rFonts w:ascii="Aptos" w:hAnsi="Aptos" w:cs="Aptos"/>
-        </w:rPr>
-      </w:pPr>
-      <w:r>
-        <w:rPr>
-          <w:rFonts w:ascii="MS Gothic" w:eastAsia="MS Gothic" w:hAnsi="MS Gothic" w:cs="MS Gothic" w:hint="eastAsia"/>
-        </w:rPr>
-        <w:t>├</w:t>
-      </w:r>
-      <w:r>
-        <w:rPr>
-          <w:rFonts w:ascii="Aptos" w:hAnsi="Aptos" w:cs="Aptos"/>
-        </w:rPr>
-        <w:t>──</w:t>
-      </w:r>
-      <w:r>
-        <w:t xml:space="preserve"> tips </w:t>
-      </w:r>
-      <w:r>
-        <w:rPr>
-          <w:rFonts w:ascii="Aptos" w:hAnsi="Aptos" w:cs="Aptos"/>
-        </w:rPr>
-        <w:t>│</w:t>
-      </w:r>
-    </w:p>
-    <w:p>
-      <w:pPr>
-        <w:rPr>
-          <w:rFonts w:ascii="Aptos" w:hAnsi="Aptos" w:cs="Aptos"/>
-        </w:rPr>
-      </w:pPr>
-      <w:r>
-        <w:t xml:space="preserve"> </w:t>
-      </w:r>
       <w:r>
         <w:rPr>
           <w:rFonts w:ascii="Aptos" w:hAnsi="Aptos" w:cs="Aptos"/>
@@ -612,39 +624,14 @@
         <w:t>└──</w:t>
       </w:r>
       <w:r>
-        <w:t xml:space="preserve"> uitleg </w:t>
-      </w:r>
-      <w:r>
-        <w:rPr>
-          <w:rFonts w:ascii="Aptos" w:hAnsi="Aptos" w:cs="Aptos"/>
-        </w:rPr>
-        <w:t>│</w:t>
-      </w:r>
-    </w:p>
-    <w:p>
-      <w:r>
-        <w:t xml:space="preserve"> </w:t>
-      </w:r>
-      <w:r>
-        <w:rPr>
-          <w:rFonts w:ascii="Aptos" w:hAnsi="Aptos" w:cs="Aptos"/>
-        </w:rPr>
-        <w:t>└──</w:t>
-      </w:r>
-      <w:r>
         <w:t xml:space="preserve"> [PWA / Offline]</w:t>
       </w:r>
     </w:p>
     <w:p>
       <w:r>
         <w:lastRenderedPageBreak/>
-        <w:t xml:space="preserve"> └── service </w:t>
-      </w:r>
-      <w:proofErr w:type="spellStart"/>
-      <w:r>
-        <w:t>worker</w:t>
-      </w:r>
-      <w:proofErr w:type="spellEnd"/>
+        <w:t xml:space="preserve"> └── service worker</w:t>
+      </w:r>
     </w:p>
     <w:p/>
     <w:p>
@@ -1265,6 +1252,7 @@
   <w:style w:type="character" w:default="1" w:styleId="Standaardalinea-lettertype">
     <w:name w:val="Default Paragraph Font"/>
     <w:uiPriority w:val="1"/>
+    <w:semiHidden/>
     <w:unhideWhenUsed/>
   </w:style>
   <w:style w:type="table" w:default="1" w:styleId="Standaardtabel">

</xml_diff>